<commit_message>
Preserve DOCX code whitespace and add #36 count footers
</commit_message>
<xml_diff>
--- a/media/export-reference-top.docx
+++ b/media/export-reference-top.docx
@@ -1222,6 +1222,32 @@
       <w:spacing w:before="0" w:after="180" w:line="240" w:lineRule="auto"/>
       <w:ind w:left="60" w:right="60"/>
       <w:jc w:val="left"/>
+    </w:pPr>
+  </w:style>
+  <w:style w:type="paragraph" w:customStyle="1" w:styleId="CodeLanguageWithCount">
+    <w:name w:val="Code Language With Count"/>
+    <w:basedOn w:val="CodeLanguage"/>
+    <w:pPr>
+      <w:keepNext/>
+      <w:spacing w:before="0" w:after="0"/>
+    </w:pPr>
+  </w:style>
+  <w:style w:type="paragraph" w:customStyle="1" w:styleId="CodeLanguageBottomLeftWithCount">
+    <w:name w:val="Code Language Bottom Left With Count"/>
+    <w:basedOn w:val="CodeLanguageBottomLeft"/>
+    <w:pPr>
+      <w:keepNext/>
+      <w:spacing w:before="0" w:after="0"/>
+    </w:pPr>
+  </w:style>
+  <w:style w:type="paragraph" w:customStyle="1" w:styleId="CodeLineCount">
+    <w:name w:val="Code Line Count"/>
+    <w:basedOn w:val="CodeLanguage"/>
+    <w:pPr>
+      <w:keepNext w:val="0"/>
+      <w:jc w:val="left"/>
+      <w:ind w:left="60" w:right="60"/>
+      <w:spacing w:before="0" w:after="180"/>
     </w:pPr>
   </w:style>
 </w:styles>

</xml_diff>